<commit_message>
DataExport: Finish transactions. Update documentation
</commit_message>
<xml_diff>
--- a/src/anonymized_data/Anonymisering af transaktionsdata fra Mosemaskinen.docx
+++ b/src/anonymized_data/Anonymisering af transaktionsdata fra Mosemaskinen.docx
@@ -53,23 +53,7 @@
       </w:r>
       <w:r>
         <w:br/>
-        <w:t xml:space="preserve">Felter som </w:t>
-      </w:r>
-      <w:proofErr w:type="spellStart"/>
-      <w:r>
-        <w:t>userId</w:t>
-      </w:r>
-      <w:proofErr w:type="spellEnd"/>
-      <w:r>
-        <w:t xml:space="preserve"> og </w:t>
-      </w:r>
-      <w:proofErr w:type="spellStart"/>
-      <w:r>
-        <w:t>name</w:t>
-      </w:r>
-      <w:proofErr w:type="spellEnd"/>
-      <w:r>
-        <w:t xml:space="preserve"> er fjernet. Der er ingen oplysninger, der direkte kan knyttes til en person.</w:t>
+        <w:t>Felter som userId og name er fjernet. Der er ingen oplysninger, der direkte kan knyttes til en person.</w:t>
       </w:r>
     </w:p>
     <w:p>
@@ -84,43 +68,11 @@
           <w:b/>
           <w:bCs/>
         </w:rPr>
-        <w:t xml:space="preserve">Filtrering af </w:t>
-      </w:r>
-      <w:proofErr w:type="spellStart"/>
-      <w:r>
-        <w:rPr>
-          <w:b/>
-          <w:bCs/>
-        </w:rPr>
-        <w:t>ranks</w:t>
-      </w:r>
-      <w:proofErr w:type="spellEnd"/>
-      <w:r>
-        <w:rPr>
-          <w:b/>
-          <w:bCs/>
-        </w:rPr>
-        <w:t xml:space="preserve"> med få brugere (k-anonymitet)</w:t>
+        <w:t>Filtrering af ranks med få brugere (k-anonymitet)</w:t>
       </w:r>
       <w:r>
         <w:br/>
-        <w:t xml:space="preserve">Kun </w:t>
-      </w:r>
-      <w:proofErr w:type="spellStart"/>
-      <w:r>
-        <w:t>ranks</w:t>
-      </w:r>
-      <w:proofErr w:type="spellEnd"/>
-      <w:r>
-        <w:t xml:space="preserve"> med mindst 10 brugere (k = 10) inkluderes i det eksporterede datasæt. Alle andre </w:t>
-      </w:r>
-      <w:proofErr w:type="spellStart"/>
-      <w:r>
-        <w:t>ranks</w:t>
-      </w:r>
-      <w:proofErr w:type="spellEnd"/>
-      <w:r>
-        <w:t xml:space="preserve"> udelukkes.</w:t>
+        <w:t>Kun ranks med mindst 10 brugere (k = 10) inkluderes i det eksporterede datasæt. Alle andre ranks udelukkes.</w:t>
       </w:r>
     </w:p>
     <w:p>
@@ -135,11 +87,33 @@
           <w:b/>
           <w:bCs/>
         </w:rPr>
-        <w:t>Tidsafrunding til anonymiserede “dage”</w:t>
+        <w:t>Tidsafrunding til</w:t>
+      </w:r>
+      <w:r>
+        <w:rPr>
+          <w:b/>
+          <w:bCs/>
+        </w:rPr>
+        <w:t xml:space="preserve"> logiske ”dage”</w:t>
+      </w:r>
+      <w:r>
+        <w:t xml:space="preserve"> </w:t>
       </w:r>
       <w:r>
         <w:br/>
-        <w:t>Tidsstempler for køb afrundes til dynamiske “dage”, defineret som perioder afbrudt af mere end 4 timers inaktivitet. Dette skjuler præcise tidspunkter.</w:t>
+        <w:t xml:space="preserve">Tidsstempler for køb afrundes til </w:t>
+      </w:r>
+      <w:r>
+        <w:t>logiske dage, der går fra 05:00 til 05:00 kalenderdagen efter</w:t>
+      </w:r>
+      <w:r>
+        <w:t>. Dette skjuler præcise tidspunkter</w:t>
+      </w:r>
+      <w:r>
+        <w:t>, og tillader at køb efter midnat tælles meningsfuldt</w:t>
+      </w:r>
+      <w:r>
+        <w:t>.</w:t>
       </w:r>
     </w:p>
     <w:p>
@@ -159,35 +133,14 @@
       <w:r>
         <w:br/>
       </w:r>
-      <w:proofErr w:type="spellStart"/>
       <w:r>
-        <w:t>kombinationer</w:t>
-      </w:r>
-      <w:proofErr w:type="spellEnd"/>
-      <w:r>
-        <w:t xml:space="preserve"> af (rank, </w:t>
-      </w:r>
-      <w:proofErr w:type="spellStart"/>
-      <w:r>
-        <w:t>itemId</w:t>
-      </w:r>
-      <w:proofErr w:type="spellEnd"/>
-      <w:r>
-        <w:t>, dag) med færre end 3 unikke brugere</w:t>
+        <w:t>kombinationer af (rank, itemId, dag) med færre end 3 unikke brugere</w:t>
       </w:r>
       <w:r>
         <w:t xml:space="preserve"> </w:t>
       </w:r>
       <w:r>
-        <w:t xml:space="preserve">får </w:t>
-      </w:r>
-      <w:proofErr w:type="spellStart"/>
-      <w:r>
-        <w:t>itemId</w:t>
-      </w:r>
-      <w:proofErr w:type="spellEnd"/>
-      <w:r>
-        <w:t xml:space="preserve"> erstattet med værdien 'ANDRE_VARER' for at forhindre identifikation baseret på unikke købsmønstre.</w:t>
+        <w:t>får itemId erstattet med værdien 'ANDRE_VARER' for at forhindre identifikation baseret på unikke købsmønstre.</w:t>
       </w:r>
     </w:p>
     <w:p>
@@ -206,15 +159,7 @@
       </w:r>
       <w:r>
         <w:br/>
-        <w:t xml:space="preserve">Individuelle køb vises ikke. I stedet indeholder datasættet antallet af transaktioner per kombination af (rank, </w:t>
-      </w:r>
-      <w:proofErr w:type="spellStart"/>
-      <w:r>
-        <w:t>itemId</w:t>
-      </w:r>
-      <w:proofErr w:type="spellEnd"/>
-      <w:r>
-        <w:t>, anonymiseret dag).</w:t>
+        <w:t>Individuelle køb vises ikke. I stedet indeholder datasættet antallet af transaktioner per kombination af (rank, itemId, anonymiseret dag).</w:t>
       </w:r>
     </w:p>
     <w:p>
@@ -229,27 +174,11 @@
           <w:b/>
           <w:bCs/>
         </w:rPr>
-        <w:t xml:space="preserve">Maskering af ekskluderede </w:t>
+        <w:t>Maskering af ekskluderede ranks</w:t>
       </w:r>
-      <w:proofErr w:type="spellStart"/>
-      <w:r>
-        <w:rPr>
-          <w:b/>
-          <w:bCs/>
-        </w:rPr>
-        <w:t>ranks</w:t>
-      </w:r>
-      <w:proofErr w:type="spellEnd"/>
       <w:r>
         <w:br/>
-      </w:r>
-      <w:proofErr w:type="spellStart"/>
-      <w:r>
-        <w:t>Ranks</w:t>
-      </w:r>
-      <w:proofErr w:type="spellEnd"/>
-      <w:r>
-        <w:t xml:space="preserve"> med færre end 10 brugere maskeres i oversigtstabellen som '[EKSKLUDERET]' for at undgå, at navne eller unikke betegnelser afsløres.</w:t>
+        <w:t>Ranks med færre end 10 brugere maskeres i oversigtstabellen som '[EKSKLUDERET]' for at undgå, at navne eller unikke betegnelser afsløres.</w:t>
       </w:r>
     </w:p>
     <w:p>
@@ -420,31 +349,7 @@
                 <w:lang w:eastAsia="da-DK"/>
                 <w14:ligatures w14:val="none"/>
               </w:rPr>
-              <w:t xml:space="preserve">Brugernes rolle (kun </w:t>
-            </w:r>
-            <w:proofErr w:type="spellStart"/>
-            <w:r>
-              <w:rPr>
-                <w:rFonts w:ascii="Times New Roman" w:eastAsia="Times New Roman" w:hAnsi="Times New Roman" w:cs="Times New Roman"/>
-                <w:kern w:val="0"/>
-                <w:sz w:val="24"/>
-                <w:szCs w:val="24"/>
-                <w:lang w:eastAsia="da-DK"/>
-                <w14:ligatures w14:val="none"/>
-              </w:rPr>
-              <w:t>ranks</w:t>
-            </w:r>
-            <w:proofErr w:type="spellEnd"/>
-            <w:r>
-              <w:rPr>
-                <w:rFonts w:ascii="Times New Roman" w:eastAsia="Times New Roman" w:hAnsi="Times New Roman" w:cs="Times New Roman"/>
-                <w:kern w:val="0"/>
-                <w:sz w:val="24"/>
-                <w:szCs w:val="24"/>
-                <w:lang w:eastAsia="da-DK"/>
-                <w14:ligatures w14:val="none"/>
-              </w:rPr>
-              <w:t xml:space="preserve"> med ≥10 brugere)</w:t>
+              <w:t>Brugernes rolle (kun ranks med ≥10 brugere)</w:t>
             </w:r>
           </w:p>
         </w:tc>
@@ -471,7 +376,6 @@
                 <w14:ligatures w14:val="none"/>
               </w:rPr>
             </w:pPr>
-            <w:proofErr w:type="spellStart"/>
             <w:r>
               <w:rPr>
                 <w:rFonts w:ascii="Courier New" w:eastAsia="Times New Roman" w:hAnsi="Courier New" w:cs="Courier New"/>
@@ -483,7 +387,6 @@
               </w:rPr>
               <w:t>itemId</w:t>
             </w:r>
-            <w:proofErr w:type="spellEnd"/>
           </w:p>
         </w:tc>
         <w:tc>
@@ -562,7 +465,6 @@
                 <w14:ligatures w14:val="none"/>
               </w:rPr>
             </w:pPr>
-            <w:proofErr w:type="spellStart"/>
             <w:r>
               <w:rPr>
                 <w:rFonts w:ascii="Courier New" w:eastAsia="Times New Roman" w:hAnsi="Courier New" w:cs="Courier New"/>
@@ -574,7 +476,6 @@
               </w:rPr>
               <w:t>day</w:t>
             </w:r>
-            <w:proofErr w:type="spellEnd"/>
           </w:p>
         </w:tc>
         <w:tc>
@@ -631,7 +532,6 @@
                 <w14:ligatures w14:val="none"/>
               </w:rPr>
             </w:pPr>
-            <w:proofErr w:type="spellStart"/>
             <w:r>
               <w:rPr>
                 <w:rFonts w:ascii="Courier New" w:eastAsia="Times New Roman" w:hAnsi="Courier New" w:cs="Courier New"/>
@@ -643,7 +543,6 @@
               </w:rPr>
               <w:t>count</w:t>
             </w:r>
-            <w:proofErr w:type="spellEnd"/>
           </w:p>
         </w:tc>
         <w:tc>
@@ -681,13 +580,8 @@
     </w:tbl>
     <w:p/>
     <w:p>
-      <w:proofErr w:type="spellStart"/>
       <w:r>
-        <w:t>Ranks</w:t>
-      </w:r>
-      <w:proofErr w:type="spellEnd"/>
-      <w:r>
-        <w:t>:</w:t>
+        <w:t>Ranks:</w:t>
       </w:r>
     </w:p>
     <w:tbl>
@@ -868,31 +762,7 @@
                 <w:lang w:eastAsia="da-DK"/>
                 <w14:ligatures w14:val="none"/>
               </w:rPr>
-              <w:t xml:space="preserve"> hvis </w:t>
-            </w:r>
-            <w:proofErr w:type="spellStart"/>
-            <w:r>
-              <w:rPr>
-                <w:rFonts w:ascii="Times New Roman" w:eastAsia="Times New Roman" w:hAnsi="Times New Roman" w:cs="Times New Roman"/>
-                <w:kern w:val="0"/>
-                <w:sz w:val="24"/>
-                <w:szCs w:val="24"/>
-                <w:lang w:eastAsia="da-DK"/>
-                <w14:ligatures w14:val="none"/>
-              </w:rPr>
-              <w:t>user_count</w:t>
-            </w:r>
-            <w:proofErr w:type="spellEnd"/>
-            <w:r>
-              <w:rPr>
-                <w:rFonts w:ascii="Times New Roman" w:eastAsia="Times New Roman" w:hAnsi="Times New Roman" w:cs="Times New Roman"/>
-                <w:kern w:val="0"/>
-                <w:sz w:val="24"/>
-                <w:szCs w:val="24"/>
-                <w:lang w:eastAsia="da-DK"/>
-                <w14:ligatures w14:val="none"/>
-              </w:rPr>
-              <w:t xml:space="preserve"> &lt; 10</w:t>
+              <w:t xml:space="preserve"> hvis user_count &lt; 10</w:t>
             </w:r>
           </w:p>
         </w:tc>
@@ -919,7 +789,6 @@
                 <w14:ligatures w14:val="none"/>
               </w:rPr>
             </w:pPr>
-            <w:proofErr w:type="spellStart"/>
             <w:r>
               <w:rPr>
                 <w:rFonts w:ascii="Courier New" w:eastAsia="Times New Roman" w:hAnsi="Courier New" w:cs="Courier New"/>
@@ -931,7 +800,6 @@
               </w:rPr>
               <w:t>user_count</w:t>
             </w:r>
-            <w:proofErr w:type="spellEnd"/>
           </w:p>
         </w:tc>
         <w:tc>
@@ -988,7 +856,6 @@
                 <w14:ligatures w14:val="none"/>
               </w:rPr>
             </w:pPr>
-            <w:proofErr w:type="spellStart"/>
             <w:r>
               <w:rPr>
                 <w:rFonts w:ascii="Courier New" w:eastAsia="Times New Roman" w:hAnsi="Courier New" w:cs="Courier New"/>
@@ -1000,7 +867,6 @@
               </w:rPr>
               <w:t>is_included</w:t>
             </w:r>
-            <w:proofErr w:type="spellEnd"/>
           </w:p>
         </w:tc>
         <w:tc>
@@ -1195,7 +1061,6 @@
                 <w14:ligatures w14:val="none"/>
               </w:rPr>
             </w:pPr>
-            <w:proofErr w:type="spellStart"/>
             <w:r>
               <w:rPr>
                 <w:rFonts w:ascii="Courier New" w:eastAsia="Times New Roman" w:hAnsi="Courier New" w:cs="Courier New"/>
@@ -1207,7 +1072,6 @@
               </w:rPr>
               <w:t>itemId</w:t>
             </w:r>
-            <w:proofErr w:type="spellEnd"/>
           </w:p>
         </w:tc>
         <w:tc>
@@ -1264,7 +1128,6 @@
                 <w14:ligatures w14:val="none"/>
               </w:rPr>
             </w:pPr>
-            <w:proofErr w:type="spellStart"/>
             <w:r>
               <w:rPr>
                 <w:rFonts w:ascii="Courier New" w:eastAsia="Times New Roman" w:hAnsi="Courier New" w:cs="Courier New"/>
@@ -1276,7 +1139,6 @@
               </w:rPr>
               <w:t>name</w:t>
             </w:r>
-            <w:proofErr w:type="spellEnd"/>
           </w:p>
         </w:tc>
         <w:tc>
@@ -1333,7 +1195,6 @@
                 <w14:ligatures w14:val="none"/>
               </w:rPr>
             </w:pPr>
-            <w:proofErr w:type="spellStart"/>
             <w:r>
               <w:rPr>
                 <w:rFonts w:ascii="Courier New" w:eastAsia="Times New Roman" w:hAnsi="Courier New" w:cs="Courier New"/>
@@ -1345,7 +1206,6 @@
               </w:rPr>
               <w:t>price</w:t>
             </w:r>
-            <w:proofErr w:type="spellEnd"/>
           </w:p>
         </w:tc>
         <w:tc>
@@ -1402,7 +1262,6 @@
                 <w14:ligatures w14:val="none"/>
               </w:rPr>
             </w:pPr>
-            <w:proofErr w:type="spellStart"/>
             <w:r>
               <w:rPr>
                 <w:rFonts w:ascii="Courier New" w:eastAsia="Times New Roman" w:hAnsi="Courier New" w:cs="Courier New"/>
@@ -1414,7 +1273,6 @@
               </w:rPr>
               <w:t>category</w:t>
             </w:r>
-            <w:proofErr w:type="spellEnd"/>
           </w:p>
         </w:tc>
         <w:tc>
@@ -1471,7 +1329,6 @@
                 <w14:ligatures w14:val="none"/>
               </w:rPr>
             </w:pPr>
-            <w:proofErr w:type="spellStart"/>
             <w:r>
               <w:rPr>
                 <w:rFonts w:ascii="Courier New" w:eastAsia="Times New Roman" w:hAnsi="Courier New" w:cs="Courier New"/>
@@ -1483,7 +1340,6 @@
               </w:rPr>
               <w:t>current_stock</w:t>
             </w:r>
-            <w:proofErr w:type="spellEnd"/>
           </w:p>
         </w:tc>
         <w:tc>
@@ -1540,7 +1396,6 @@
                 <w14:ligatures w14:val="none"/>
               </w:rPr>
             </w:pPr>
-            <w:proofErr w:type="spellStart"/>
             <w:r>
               <w:rPr>
                 <w:rFonts w:ascii="Courier New" w:eastAsia="Times New Roman" w:hAnsi="Courier New" w:cs="Courier New"/>
@@ -1552,51 +1407,37 @@
               </w:rPr>
               <w:t>initial_stock</w:t>
             </w:r>
-            <w:proofErr w:type="spellEnd"/>
-          </w:p>
-        </w:tc>
-        <w:tc>
-          <w:tcPr>
-            <w:tcW w:w="0" w:type="auto"/>
-            <w:vAlign w:val="center"/>
-            <w:hideMark/>
-          </w:tcPr>
-          <w:p>
-            <w:pPr>
-              <w:spacing w:after="0" w:line="240" w:lineRule="auto"/>
-              <w:rPr>
-                <w:rFonts w:ascii="Times New Roman" w:eastAsia="Times New Roman" w:hAnsi="Times New Roman" w:cs="Times New Roman"/>
-                <w:kern w:val="0"/>
-                <w:sz w:val="24"/>
-                <w:szCs w:val="24"/>
-                <w:lang w:eastAsia="da-DK"/>
-                <w14:ligatures w14:val="none"/>
-              </w:rPr>
-            </w:pPr>
-            <w:r>
-              <w:rPr>
-                <w:rFonts w:ascii="Times New Roman" w:eastAsia="Times New Roman" w:hAnsi="Times New Roman" w:cs="Times New Roman"/>
-                <w:kern w:val="0"/>
-                <w:sz w:val="24"/>
-                <w:szCs w:val="24"/>
-                <w:lang w:eastAsia="da-DK"/>
-                <w14:ligatures w14:val="none"/>
-              </w:rPr>
-              <w:t xml:space="preserve">Antal på lager ved </w:t>
-            </w:r>
-            <w:proofErr w:type="spellStart"/>
-            <w:r>
-              <w:rPr>
-                <w:rFonts w:ascii="Times New Roman" w:eastAsia="Times New Roman" w:hAnsi="Times New Roman" w:cs="Times New Roman"/>
-                <w:kern w:val="0"/>
-                <w:sz w:val="24"/>
-                <w:szCs w:val="24"/>
-                <w:lang w:eastAsia="da-DK"/>
-                <w14:ligatures w14:val="none"/>
-              </w:rPr>
-              <w:t>tourstart</w:t>
-            </w:r>
-            <w:proofErr w:type="spellEnd"/>
+          </w:p>
+        </w:tc>
+        <w:tc>
+          <w:tcPr>
+            <w:tcW w:w="0" w:type="auto"/>
+            <w:vAlign w:val="center"/>
+            <w:hideMark/>
+          </w:tcPr>
+          <w:p>
+            <w:pPr>
+              <w:spacing w:after="0" w:line="240" w:lineRule="auto"/>
+              <w:rPr>
+                <w:rFonts w:ascii="Times New Roman" w:eastAsia="Times New Roman" w:hAnsi="Times New Roman" w:cs="Times New Roman"/>
+                <w:kern w:val="0"/>
+                <w:sz w:val="24"/>
+                <w:szCs w:val="24"/>
+                <w:lang w:eastAsia="da-DK"/>
+                <w14:ligatures w14:val="none"/>
+              </w:rPr>
+            </w:pPr>
+            <w:r>
+              <w:rPr>
+                <w:rFonts w:ascii="Times New Roman" w:eastAsia="Times New Roman" w:hAnsi="Times New Roman" w:cs="Times New Roman"/>
+                <w:kern w:val="0"/>
+                <w:sz w:val="24"/>
+                <w:szCs w:val="24"/>
+                <w:lang w:eastAsia="da-DK"/>
+                <w14:ligatures w14:val="none"/>
+              </w:rPr>
+              <w:t>Antal på lager ved tourstart</w:t>
+            </w:r>
           </w:p>
         </w:tc>
       </w:tr>
@@ -2452,6 +2293,7 @@
   <w:style w:type="character" w:default="1" w:styleId="Standardskrifttypeiafsnit">
     <w:name w:val="Default Paragraph Font"/>
     <w:uiPriority w:val="1"/>
+    <w:semiHidden/>
     <w:unhideWhenUsed/>
   </w:style>
   <w:style w:type="table" w:default="1" w:styleId="Tabel-Normal">

</xml_diff>